<commit_message>
file updates and further uploads
Changes in Workshop program file:
- added explanation on how to download a whole folder from github
- added links to individual github folders for the workshops
- added a link to the GDrive folder with example omages for SNO

Uploaded PHYTOPAM Manual
</commit_message>
<xml_diff>
--- a/2026MOB/MICROSCALE OCEAN BIOPHYSICS 8 Workshop Program.docx
+++ b/2026MOB/MICROSCALE OCEAN BIOPHYSICS 8 Workshop Program.docx
@@ -41,7 +41,18 @@
       </w:r>
       <w:proofErr w:type="spellEnd"/>
       <w:r>
-        <w:t xml:space="preserve"> (post 2020) and the following Toolboxes: Image Analysis Toolbox and Curve Fitting Toolbox. It would be helpful to install them before arriving. We will also be following up with software to download for different days of the workshops. Material for the workshops will be provided in </w:t>
+        <w:t xml:space="preserve"> (post 2020) and the following Toolboxes: Image Analysis Toolbox and Curve Fitting Toolbox. It would be helpful to install them before arriving. We will also be following up with software to download for different days of the workshops. </w:t>
+      </w:r>
+    </w:p>
+    <w:p/>
+    <w:p>
+      <w:r>
+        <w:t>REPOSITORY FOR WORKHOP MATERIAL</w:t>
+      </w:r>
+    </w:p>
+    <w:p>
+      <w:r>
+        <w:t xml:space="preserve">Material for the workshops will be provided in </w:t>
       </w:r>
       <w:hyperlink r:id="rId5">
         <w:r>
@@ -54,6 +65,103 @@
       </w:hyperlink>
       <w:r>
         <w:t xml:space="preserve"> on GitHub.</w:t>
+      </w:r>
+    </w:p>
+    <w:p>
+      <w:r>
+        <w:t xml:space="preserve">NOTE: If you want to </w:t>
+      </w:r>
+      <w:r>
+        <w:rPr>
+          <w:b/>
+          <w:bCs/>
+        </w:rPr>
+        <w:t>download a</w:t>
+      </w:r>
+      <w:r>
+        <w:rPr>
+          <w:b/>
+          <w:bCs/>
+        </w:rPr>
+        <w:t xml:space="preserve">n entire </w:t>
+      </w:r>
+      <w:r>
+        <w:rPr>
+          <w:b/>
+          <w:bCs/>
+        </w:rPr>
+        <w:t>folder from the repository</w:t>
+      </w:r>
+      <w:r>
+        <w:t xml:space="preserve">: </w:t>
+      </w:r>
+    </w:p>
+    <w:p>
+      <w:r>
+        <w:t xml:space="preserve">- </w:t>
+      </w:r>
+      <w:r>
+        <w:t xml:space="preserve">navigate to your desired repository, </w:t>
+      </w:r>
+    </w:p>
+    <w:p>
+      <w:r>
+        <w:t xml:space="preserve">- </w:t>
+      </w:r>
+      <w:r>
+        <w:t xml:space="preserve">select the folder you want to download from GitHub, </w:t>
+      </w:r>
+    </w:p>
+    <w:p>
+      <w:r>
+        <w:t xml:space="preserve">- </w:t>
+      </w:r>
+      <w:r>
+        <w:t>copy the URL</w:t>
+      </w:r>
+    </w:p>
+    <w:p>
+      <w:r>
+        <w:t xml:space="preserve">- </w:t>
+      </w:r>
+      <w:r>
+        <w:t xml:space="preserve">navigate to </w:t>
+      </w:r>
+      <w:hyperlink r:id="rId6" w:history="1">
+        <w:r>
+          <w:rPr>
+            <w:rStyle w:val="Hyperlink"/>
+          </w:rPr>
+          <w:t>https://download-</w:t>
+        </w:r>
+        <w:r>
+          <w:rPr>
+            <w:rStyle w:val="Hyperlink"/>
+          </w:rPr>
+          <w:t>d</w:t>
+        </w:r>
+        <w:r>
+          <w:rPr>
+            <w:rStyle w:val="Hyperlink"/>
+          </w:rPr>
+          <w:t>irectory.github.io/</w:t>
+        </w:r>
+      </w:hyperlink>
+      <w:r>
+        <w:t xml:space="preserve"> </w:t>
+      </w:r>
+    </w:p>
+    <w:p>
+      <w:r>
+        <w:t xml:space="preserve">- </w:t>
+      </w:r>
+      <w:r>
+        <w:t>paste the URL into the text box, and hit enter </w:t>
+      </w:r>
+    </w:p>
+    <w:p>
+      <w:r>
+        <w:t>the folder will be saved as a .zip file in your computer.</w:t>
       </w:r>
     </w:p>
     <w:p/>
@@ -1203,19 +1311,11 @@
     <w:p/>
     <w:p/>
     <w:p/>
-    <w:p/>
-    <w:p/>
-    <w:p/>
-    <w:p/>
-    <w:p/>
-    <w:p/>
-    <w:p/>
-    <w:p/>
-    <w:p/>
-    <w:p/>
-    <w:p/>
-    <w:p/>
-    <w:p/>
+    <w:p>
+      <w:r>
+        <w:br w:type="page"/>
+      </w:r>
+    </w:p>
     <w:p>
       <w:pPr>
         <w:jc w:val="center"/>
@@ -1233,6 +1333,7 @@
           <w:sz w:val="32"/>
           <w:szCs w:val="32"/>
         </w:rPr>
+        <w:lastRenderedPageBreak/>
         <w:t>The methods and theory of marine particle aggregation, sedimentation, and rheology (SNO)</w:t>
       </w:r>
     </w:p>
@@ -1310,7 +1411,7 @@
           <w:szCs w:val="24"/>
         </w:rPr>
       </w:pPr>
-      <w:hyperlink r:id="rId6">
+      <w:hyperlink r:id="rId7">
         <w:r>
           <w:rPr>
             <w:color w:val="1155CC"/>
@@ -1351,7 +1452,7 @@
           <w:szCs w:val="24"/>
         </w:rPr>
       </w:pPr>
-      <w:hyperlink r:id="rId7">
+      <w:hyperlink r:id="rId8">
         <w:r>
           <w:rPr>
             <w:color w:val="1155CC"/>
@@ -1392,7 +1493,7 @@
           <w:szCs w:val="24"/>
         </w:rPr>
       </w:pPr>
-      <w:hyperlink r:id="rId8">
+      <w:hyperlink r:id="rId9">
         <w:r>
           <w:rPr>
             <w:color w:val="1155CC"/>
@@ -1421,6 +1522,51 @@
         <w:rPr>
           <w:b/>
           <w:bCs/>
+        </w:rPr>
+        <w:t>REPOSITORY</w:t>
+      </w:r>
+      <w:r>
+        <w:t xml:space="preserve">: Main repo </w:t>
+      </w:r>
+      <w:hyperlink r:id="rId10" w:history="1">
+        <w:r>
+          <w:rPr>
+            <w:rStyle w:val="Hyperlink"/>
+          </w:rPr>
+          <w:t>here</w:t>
+        </w:r>
+      </w:hyperlink>
+      <w:r>
+        <w:t xml:space="preserve">; Example images </w:t>
+      </w:r>
+      <w:hyperlink r:id="rId11" w:history="1">
+        <w:r>
+          <w:rPr>
+            <w:rStyle w:val="Hyperlink"/>
+          </w:rPr>
+          <w:t>here</w:t>
+        </w:r>
+      </w:hyperlink>
+    </w:p>
+    <w:p>
+      <w:pPr>
+        <w:jc w:val="both"/>
+        <w:rPr>
+          <w:b/>
+          <w:bCs/>
+          <w:sz w:val="24"/>
+          <w:szCs w:val="24"/>
+        </w:rPr>
+      </w:pPr>
+    </w:p>
+    <w:p>
+      <w:pPr>
+        <w:jc w:val="both"/>
+      </w:pPr>
+      <w:r>
+        <w:rPr>
+          <w:b/>
+          <w:bCs/>
           <w:sz w:val="24"/>
           <w:szCs w:val="24"/>
         </w:rPr>
@@ -1570,27 +1716,6 @@
         <w:rPr>
           <w:b/>
           <w:bCs/>
-          <w:sz w:val="24"/>
-          <w:szCs w:val="24"/>
-        </w:rPr>
-      </w:pPr>
-    </w:p>
-    <w:p>
-      <w:pPr>
-        <w:rPr>
-          <w:b/>
-          <w:bCs/>
-          <w:sz w:val="24"/>
-          <w:szCs w:val="24"/>
-        </w:rPr>
-      </w:pPr>
-    </w:p>
-    <w:p>
-      <w:pPr>
-        <w:jc w:val="center"/>
-        <w:rPr>
-          <w:b/>
-          <w:bCs/>
           <w:sz w:val="32"/>
           <w:szCs w:val="32"/>
         </w:rPr>
@@ -1602,6 +1727,26 @@
           <w:sz w:val="32"/>
           <w:szCs w:val="32"/>
         </w:rPr>
+        <w:br w:type="page"/>
+      </w:r>
+    </w:p>
+    <w:p>
+      <w:pPr>
+        <w:jc w:val="center"/>
+        <w:rPr>
+          <w:b/>
+          <w:bCs/>
+          <w:sz w:val="32"/>
+          <w:szCs w:val="32"/>
+        </w:rPr>
+      </w:pPr>
+      <w:r>
+        <w:rPr>
+          <w:b/>
+          <w:bCs/>
+          <w:sz w:val="32"/>
+          <w:szCs w:val="32"/>
+        </w:rPr>
         <w:lastRenderedPageBreak/>
         <w:t>Photosynthetic parameters from chlorophyll autofluorescence (PAM)</w:t>
       </w:r>
@@ -1655,7 +1800,7 @@
           <w:szCs w:val="24"/>
         </w:rPr>
       </w:pPr>
-      <w:hyperlink r:id="rId9">
+      <w:hyperlink r:id="rId12">
         <w:r>
           <w:rPr>
             <w:color w:val="1155CC"/>
@@ -1696,7 +1841,7 @@
           <w:szCs w:val="24"/>
         </w:rPr>
       </w:pPr>
-      <w:hyperlink r:id="rId10">
+      <w:hyperlink r:id="rId13">
         <w:r>
           <w:rPr>
             <w:color w:val="1155CC"/>
@@ -1719,6 +1864,32 @@
     <w:p>
       <w:pPr>
         <w:jc w:val="both"/>
+      </w:pPr>
+      <w:r>
+        <w:rPr>
+          <w:b/>
+          <w:bCs/>
+        </w:rPr>
+        <w:t>REPOSITORY</w:t>
+      </w:r>
+      <w:r>
+        <w:t>: Main repo</w:t>
+      </w:r>
+      <w:r>
+        <w:t xml:space="preserve"> </w:t>
+      </w:r>
+      <w:hyperlink r:id="rId14" w:history="1">
+        <w:r>
+          <w:rPr>
+            <w:rStyle w:val="Hyperlink"/>
+          </w:rPr>
+          <w:t>here</w:t>
+        </w:r>
+      </w:hyperlink>
+    </w:p>
+    <w:p>
+      <w:pPr>
+        <w:jc w:val="both"/>
         <w:rPr>
           <w:sz w:val="24"/>
           <w:szCs w:val="24"/>
@@ -1855,28 +2026,46 @@
     </w:p>
     <w:p>
       <w:pPr>
-        <w:spacing w:line="360" w:lineRule="auto"/>
-        <w:rPr>
-          <w:b/>
-          <w:bCs/>
-          <w:sz w:val="24"/>
-          <w:szCs w:val="24"/>
-        </w:rPr>
-      </w:pPr>
-    </w:p>
-    <w:p>
-      <w:pPr>
-        <w:rPr>
-          <w:b/>
-          <w:bCs/>
-          <w:sz w:val="24"/>
-          <w:szCs w:val="24"/>
-        </w:rPr>
-      </w:pPr>
+        <w:rPr>
+          <w:b/>
+          <w:bCs/>
+          <w:sz w:val="24"/>
+          <w:szCs w:val="24"/>
+        </w:rPr>
+      </w:pPr>
+      <w:r>
+        <w:rPr>
+          <w:b/>
+          <w:bCs/>
+          <w:sz w:val="24"/>
+          <w:szCs w:val="24"/>
+        </w:rPr>
+        <w:br w:type="page"/>
+      </w:r>
     </w:p>
     <w:p>
       <w:pPr>
         <w:jc w:val="center"/>
+        <w:rPr>
+          <w:b/>
+          <w:bCs/>
+          <w:sz w:val="32"/>
+          <w:szCs w:val="32"/>
+        </w:rPr>
+      </w:pPr>
+      <w:r>
+        <w:rPr>
+          <w:b/>
+          <w:bCs/>
+          <w:sz w:val="32"/>
+          <w:szCs w:val="32"/>
+        </w:rPr>
+        <w:lastRenderedPageBreak/>
+        <w:t>Light-Driven Motility in Microalgae (MPP)</w:t>
+      </w:r>
+    </w:p>
+    <w:p>
+      <w:pPr>
         <w:rPr>
           <w:sz w:val="30"/>
           <w:szCs w:val="30"/>
@@ -1885,94 +2074,20 @@
     </w:p>
     <w:p>
       <w:pPr>
-        <w:jc w:val="center"/>
-        <w:rPr>
-          <w:sz w:val="30"/>
-          <w:szCs w:val="30"/>
-        </w:rPr>
-      </w:pPr>
-    </w:p>
-    <w:p>
-      <w:pPr>
-        <w:jc w:val="center"/>
-        <w:rPr>
-          <w:sz w:val="30"/>
-          <w:szCs w:val="30"/>
-        </w:rPr>
-      </w:pPr>
-    </w:p>
-    <w:p>
-      <w:pPr>
-        <w:jc w:val="center"/>
-        <w:rPr>
-          <w:sz w:val="30"/>
-          <w:szCs w:val="30"/>
-        </w:rPr>
-      </w:pPr>
-    </w:p>
-    <w:p>
-      <w:pPr>
-        <w:jc w:val="center"/>
-        <w:rPr>
-          <w:sz w:val="30"/>
-          <w:szCs w:val="30"/>
-        </w:rPr>
-      </w:pPr>
-    </w:p>
-    <w:p>
-      <w:pPr>
-        <w:jc w:val="center"/>
-        <w:rPr>
-          <w:sz w:val="30"/>
-          <w:szCs w:val="30"/>
-        </w:rPr>
-      </w:pPr>
-    </w:p>
-    <w:p>
-      <w:pPr>
-        <w:jc w:val="center"/>
-        <w:rPr>
-          <w:b/>
-          <w:bCs/>
-          <w:sz w:val="32"/>
-          <w:szCs w:val="32"/>
-        </w:rPr>
-      </w:pPr>
-      <w:r>
-        <w:rPr>
-          <w:b/>
-          <w:bCs/>
-          <w:sz w:val="32"/>
-          <w:szCs w:val="32"/>
-        </w:rPr>
-        <w:t>Light-Driven Motility in Microalgae (MPP)</w:t>
-      </w:r>
-    </w:p>
-    <w:p>
-      <w:pPr>
-        <w:rPr>
-          <w:sz w:val="30"/>
-          <w:szCs w:val="30"/>
-        </w:rPr>
-      </w:pPr>
-    </w:p>
-    <w:p>
-      <w:pPr>
-        <w:rPr>
-          <w:b/>
-          <w:bCs/>
-          <w:sz w:val="24"/>
-          <w:szCs w:val="24"/>
-        </w:rPr>
-      </w:pPr>
-      <w:r>
-        <w:rPr>
-          <w:b/>
-          <w:bCs/>
-          <w:sz w:val="24"/>
-          <w:szCs w:val="24"/>
-        </w:rPr>
-        <w:lastRenderedPageBreak/>
+        <w:rPr>
+          <w:b/>
+          <w:bCs/>
+          <w:sz w:val="24"/>
+          <w:szCs w:val="24"/>
+        </w:rPr>
+      </w:pPr>
+      <w:r>
+        <w:rPr>
+          <w:b/>
+          <w:bCs/>
+          <w:sz w:val="24"/>
+          <w:szCs w:val="24"/>
+        </w:rPr>
         <w:t xml:space="preserve">Leads: </w:t>
       </w:r>
     </w:p>
@@ -1998,7 +2113,7 @@
           <w:szCs w:val="24"/>
         </w:rPr>
       </w:pPr>
-      <w:hyperlink r:id="rId11">
+      <w:hyperlink r:id="rId15">
         <w:r>
           <w:rPr>
             <w:color w:val="1155CC"/>
@@ -2039,7 +2154,7 @@
           <w:szCs w:val="24"/>
         </w:rPr>
       </w:pPr>
-      <w:hyperlink r:id="rId12">
+      <w:hyperlink r:id="rId16">
         <w:r>
           <w:rPr>
             <w:color w:val="1155CC"/>
@@ -2075,6 +2190,40 @@
         <w:rPr>
           <w:b/>
           <w:bCs/>
+        </w:rPr>
+        <w:t>REPOSITORY</w:t>
+      </w:r>
+      <w:r>
+        <w:t xml:space="preserve">: Main repo </w:t>
+      </w:r>
+      <w:hyperlink r:id="rId17" w:history="1">
+        <w:r>
+          <w:rPr>
+            <w:rStyle w:val="Hyperlink"/>
+          </w:rPr>
+          <w:t>here</w:t>
+        </w:r>
+      </w:hyperlink>
+    </w:p>
+    <w:p>
+      <w:pPr>
+        <w:jc w:val="both"/>
+        <w:rPr>
+          <w:b/>
+          <w:bCs/>
+          <w:sz w:val="24"/>
+          <w:szCs w:val="24"/>
+        </w:rPr>
+      </w:pPr>
+    </w:p>
+    <w:p>
+      <w:pPr>
+        <w:jc w:val="both"/>
+      </w:pPr>
+      <w:r>
+        <w:rPr>
+          <w:b/>
+          <w:bCs/>
           <w:sz w:val="24"/>
           <w:szCs w:val="24"/>
         </w:rPr>
@@ -2234,7 +2383,6 @@
     <w:p>
       <w:pPr>
         <w:spacing w:line="360" w:lineRule="auto"/>
-        <w:ind w:left="2790"/>
       </w:pPr>
       <w:r>
         <w:t xml:space="preserve">09:15-10:00 (15:15-16:00): Practical: </w:t>
@@ -2245,13 +2393,27 @@
       </w:r>
       <w:proofErr w:type="spellEnd"/>
       <w:r>
-        <w:t>. Cell phototaxis towards/away from light; photokinesis as a consequence of UV exposure.</w:t>
+        <w:t xml:space="preserve">. Cell phototaxis towards/away from light; </w:t>
       </w:r>
     </w:p>
     <w:p>
       <w:pPr>
         <w:spacing w:line="360" w:lineRule="auto"/>
-        <w:ind w:left="2790"/>
+        <w:ind w:left="2721"/>
+      </w:pPr>
+      <w:r>
+        <w:t>photokinesis as a consequence of UV</w:t>
+      </w:r>
+      <w:r>
+        <w:t xml:space="preserve"> </w:t>
+      </w:r>
+      <w:r>
+        <w:t>exposure.</w:t>
+      </w:r>
+    </w:p>
+    <w:p>
+      <w:pPr>
+        <w:spacing w:line="360" w:lineRule="auto"/>
       </w:pPr>
       <w:r>
         <w:t>10:00-10:30 (16:00-16:30): Break</w:t>
@@ -2267,17 +2429,6 @@
     </w:p>
     <w:p>
       <w:pPr>
-        <w:spacing w:line="360" w:lineRule="auto"/>
-      </w:pPr>
-    </w:p>
-    <w:p>
-      <w:pPr>
-        <w:spacing w:line="360" w:lineRule="auto"/>
-      </w:pPr>
-    </w:p>
-    <w:p>
-      <w:pPr>
-        <w:jc w:val="center"/>
         <w:rPr>
           <w:b/>
           <w:bCs/>
@@ -2292,6 +2443,26 @@
           <w:sz w:val="32"/>
           <w:szCs w:val="32"/>
         </w:rPr>
+        <w:br w:type="page"/>
+      </w:r>
+    </w:p>
+    <w:p>
+      <w:pPr>
+        <w:jc w:val="center"/>
+        <w:rPr>
+          <w:b/>
+          <w:bCs/>
+          <w:sz w:val="32"/>
+          <w:szCs w:val="32"/>
+        </w:rPr>
+      </w:pPr>
+      <w:r>
+        <w:rPr>
+          <w:b/>
+          <w:bCs/>
+          <w:sz w:val="32"/>
+          <w:szCs w:val="32"/>
+        </w:rPr>
         <w:lastRenderedPageBreak/>
         <w:t>Sampling and observing benthic microorganisms forming biofilms (MBF)</w:t>
       </w:r>
@@ -2347,7 +2518,7 @@
           <w:szCs w:val="24"/>
         </w:rPr>
       </w:pPr>
-      <w:hyperlink r:id="rId13">
+      <w:hyperlink r:id="rId18">
         <w:r>
           <w:rPr>
             <w:color w:val="1155CC"/>
@@ -2390,7 +2561,7 @@
           <w:szCs w:val="24"/>
         </w:rPr>
       </w:pPr>
-      <w:hyperlink r:id="rId14">
+      <w:hyperlink r:id="rId19">
         <w:r>
           <w:rPr>
             <w:color w:val="1155CC"/>
@@ -2420,111 +2591,41 @@
     </w:p>
     <w:p>
       <w:pPr>
-        <w:jc w:val="both"/>
-      </w:pPr>
-      <w:r>
-        <w:rPr>
-          <w:b/>
-          <w:bCs/>
-          <w:sz w:val="24"/>
-          <w:szCs w:val="24"/>
-        </w:rPr>
-        <w:t>Overview:</w:t>
-      </w:r>
-      <w:r>
-        <w:rPr>
-          <w:sz w:val="24"/>
-          <w:szCs w:val="24"/>
-        </w:rPr>
-        <w:t xml:space="preserve"> </w:t>
-      </w:r>
-      <w:r>
-        <w:t>Here we will provide an introduction to:</w:t>
-      </w:r>
-    </w:p>
-    <w:p>
-      <w:pPr>
-        <w:ind w:firstLine="450"/>
-      </w:pPr>
-      <w:r>
-        <w:t>1. Benthic dinoflagellates (theory):</w:t>
-      </w:r>
-    </w:p>
-    <w:p>
-      <w:pPr>
-        <w:ind w:left="720"/>
-      </w:pPr>
-      <w:r>
-        <w:t>- Theoretical introduction: cells both attached to substrates and swimming; general ecology (presentation, bibliography, some movies)</w:t>
-      </w:r>
-    </w:p>
-    <w:p>
-      <w:pPr>
-        <w:ind w:firstLine="720"/>
-      </w:pPr>
-      <w:r>
-        <w:t>- Microscope observations of some cultures</w:t>
-      </w:r>
-    </w:p>
-    <w:p>
-      <w:pPr>
-        <w:ind w:firstLine="720"/>
-      </w:pPr>
-      <w:r>
-        <w:t>- Introduction to sampling benthic dinoflagellates procedure</w:t>
-      </w:r>
-    </w:p>
-    <w:p>
-      <w:pPr>
-        <w:ind w:left="450"/>
-      </w:pPr>
-      <w:r>
-        <w:t>2. Field sampling of benthic dinoflagellates and observation (if successful).</w:t>
-      </w:r>
-    </w:p>
-    <w:p>
-      <w:pPr>
-        <w:ind w:left="450"/>
-      </w:pPr>
-      <w:r>
-        <w:t xml:space="preserve">3. Quantitative imaging of plankton using </w:t>
-      </w:r>
+        <w:rPr>
+          <w:b/>
+          <w:bCs/>
+        </w:rPr>
+      </w:pPr>
+      <w:r>
+        <w:rPr>
+          <w:b/>
+          <w:bCs/>
+        </w:rPr>
+        <w:t>REPOSITORY</w:t>
+      </w:r>
+      <w:r>
+        <w:t xml:space="preserve">: Main repo </w:t>
+      </w:r>
+      <w:hyperlink r:id="rId20" w:history="1">
+        <w:r>
+          <w:rPr>
+            <w:rStyle w:val="Hyperlink"/>
+          </w:rPr>
+          <w:t>here</w:t>
+        </w:r>
+      </w:hyperlink>
+    </w:p>
+    <w:p>
       <w:proofErr w:type="spellStart"/>
       <w:r>
+        <w:rPr>
+          <w:b/>
+          <w:bCs/>
+        </w:rPr>
         <w:t>Planktoscope</w:t>
       </w:r>
       <w:proofErr w:type="spellEnd"/>
       <w:r>
-        <w:t xml:space="preserve">: a </w:t>
-      </w:r>
-      <w:proofErr w:type="gramStart"/>
-      <w:r>
-        <w:t>low cost</w:t>
-      </w:r>
-      <w:proofErr w:type="gramEnd"/>
-      <w:r>
-        <w:t xml:space="preserve"> tool that combines microscopy and fluidic for imaging plankton</w:t>
-      </w:r>
-    </w:p>
-    <w:p>
-      <w:pPr>
-        <w:rPr>
-          <w:b/>
-          <w:bCs/>
-        </w:rPr>
-      </w:pPr>
-    </w:p>
-    <w:p>
-      <w:proofErr w:type="spellStart"/>
-      <w:r>
-        <w:rPr>
-          <w:b/>
-          <w:bCs/>
-        </w:rPr>
-        <w:t>Planktoscope</w:t>
-      </w:r>
-      <w:proofErr w:type="spellEnd"/>
-      <w:r>
         <w:rPr>
           <w:b/>
           <w:bCs/>
@@ -2534,7 +2635,7 @@
       <w:r>
         <w:t xml:space="preserve"> online: </w:t>
       </w:r>
-      <w:hyperlink r:id="rId15" w:history="1">
+      <w:hyperlink r:id="rId21" w:history="1">
         <w:r>
           <w:rPr>
             <w:rStyle w:val="Hyperlink"/>
@@ -2542,6 +2643,103 @@
           <w:t>https://dx.doi.org/10.17504/protocols.io.bp2l6bq3zgqe/v5</w:t>
         </w:r>
       </w:hyperlink>
+    </w:p>
+    <w:p>
+      <w:pPr>
+        <w:jc w:val="both"/>
+        <w:rPr>
+          <w:sz w:val="24"/>
+          <w:szCs w:val="24"/>
+        </w:rPr>
+      </w:pPr>
+    </w:p>
+    <w:p>
+      <w:pPr>
+        <w:jc w:val="both"/>
+      </w:pPr>
+      <w:r>
+        <w:rPr>
+          <w:b/>
+          <w:bCs/>
+          <w:sz w:val="24"/>
+          <w:szCs w:val="24"/>
+        </w:rPr>
+        <w:t>Overview:</w:t>
+      </w:r>
+      <w:r>
+        <w:rPr>
+          <w:sz w:val="24"/>
+          <w:szCs w:val="24"/>
+        </w:rPr>
+        <w:t xml:space="preserve"> </w:t>
+      </w:r>
+      <w:r>
+        <w:t>Here we will provide an introduction to:</w:t>
+      </w:r>
+    </w:p>
+    <w:p>
+      <w:pPr>
+        <w:ind w:firstLine="450"/>
+      </w:pPr>
+      <w:r>
+        <w:t>1. Benthic dinoflagellates (theory):</w:t>
+      </w:r>
+    </w:p>
+    <w:p>
+      <w:pPr>
+        <w:ind w:left="720"/>
+      </w:pPr>
+      <w:r>
+        <w:t>- Theoretical introduction: cells both attached to substrates and swimming; general ecology (presentation, bibliography, some movies)</w:t>
+      </w:r>
+    </w:p>
+    <w:p>
+      <w:pPr>
+        <w:ind w:firstLine="720"/>
+      </w:pPr>
+      <w:r>
+        <w:t>- Microscope observations of some cultures</w:t>
+      </w:r>
+    </w:p>
+    <w:p>
+      <w:pPr>
+        <w:ind w:firstLine="720"/>
+      </w:pPr>
+      <w:r>
+        <w:t>- Introduction to sampling benthic dinoflagellates procedure</w:t>
+      </w:r>
+    </w:p>
+    <w:p>
+      <w:pPr>
+        <w:ind w:left="450"/>
+      </w:pPr>
+      <w:r>
+        <w:t>2. Field sampling of benthic dinoflagellates and observation (if successful).</w:t>
+      </w:r>
+    </w:p>
+    <w:p>
+      <w:pPr>
+        <w:ind w:left="450"/>
+      </w:pPr>
+      <w:r>
+        <w:t xml:space="preserve">3. Quantitative imaging of plankton using </w:t>
+      </w:r>
+      <w:proofErr w:type="spellStart"/>
+      <w:r>
+        <w:t>Planktoscope</w:t>
+      </w:r>
+      <w:proofErr w:type="spellEnd"/>
+      <w:r>
+        <w:t xml:space="preserve">: a </w:t>
+      </w:r>
+      <w:proofErr w:type="gramStart"/>
+      <w:r>
+        <w:t>low cost</w:t>
+      </w:r>
+      <w:proofErr w:type="gramEnd"/>
+      <w:r>
+        <w:t xml:space="preserve"> tool that combines microscopy and fluidic for imaging plankton</w:t>
+      </w:r>
     </w:p>
     <w:p>
       <w:pPr>
@@ -3540,6 +3738,18 @@
       <w:shd w:val="clear" w:color="auto" w:fill="E1DFDD"/>
     </w:rPr>
   </w:style>
+  <w:style w:type="character" w:styleId="FollowedHyperlink">
+    <w:name w:val="FollowedHyperlink"/>
+    <w:basedOn w:val="DefaultParagraphFont"/>
+    <w:uiPriority w:val="99"/>
+    <w:semiHidden/>
+    <w:unhideWhenUsed/>
+    <w:rsid w:val="00EA0BB8"/>
+    <w:rPr>
+      <w:color w:val="800080" w:themeColor="followedHyperlink"/>
+      <w:u w:val="single"/>
+    </w:rPr>
+  </w:style>
 </w:styles>
 </file>
 

</xml_diff>

<commit_message>
updated general programme; included microrheology material; included phototaxis material
</commit_message>
<xml_diff>
--- a/2026MOB/MICROSCALE OCEAN BIOPHYSICS 8 Workshop Program.docx
+++ b/2026MOB/MICROSCALE OCEAN BIOPHYSICS 8 Workshop Program.docx
@@ -132,19 +132,7 @@
           <w:rPr>
             <w:rStyle w:val="Hyperlink"/>
           </w:rPr>
-          <w:t>https://download-</w:t>
-        </w:r>
-        <w:r>
-          <w:rPr>
-            <w:rStyle w:val="Hyperlink"/>
-          </w:rPr>
-          <w:t>d</w:t>
-        </w:r>
-        <w:r>
-          <w:rPr>
-            <w:rStyle w:val="Hyperlink"/>
-          </w:rPr>
-          <w:t>irectory.github.io/</w:t>
+          <w:t>https://download-directory.github.io/</w:t>
         </w:r>
       </w:hyperlink>
       <w:r>
@@ -1656,7 +1644,10 @@
         <w:ind w:firstLine="720"/>
       </w:pPr>
       <w:r>
-        <w:t>Station B: Particle Sedimentation</w:t>
+        <w:t xml:space="preserve">Station B: </w:t>
+      </w:r>
+      <w:r>
+        <w:t>Multiple Particle Tracking Microrheology</w:t>
       </w:r>
     </w:p>
     <w:p>
@@ -1873,10 +1864,7 @@
         <w:t>REPOSITORY</w:t>
       </w:r>
       <w:r>
-        <w:t>: Main repo</w:t>
-      </w:r>
-      <w:r>
-        <w:t xml:space="preserve"> </w:t>
+        <w:t xml:space="preserve">: Main repo </w:t>
       </w:r>
       <w:hyperlink r:id="rId14" w:history="1">
         <w:r>
@@ -3641,6 +3629,7 @@
   <w:style w:type="character" w:default="1" w:styleId="DefaultParagraphFont">
     <w:name w:val="Default Paragraph Font"/>
     <w:uiPriority w:val="1"/>
+    <w:semiHidden/>
     <w:unhideWhenUsed/>
   </w:style>
   <w:style w:type="table" w:default="1" w:styleId="TableNormal">

</xml_diff>